<commit_message>
Fixed PDF and Added Diagrams for Rudolph
</commit_message>
<xml_diff>
--- a/docs/COS 214 Project PDF.docx
+++ b/docs/COS 214 Project PDF.docx
@@ -505,47 +505,7 @@
           <w:color w:val="000000" w:themeColor="text1"/>
         </w:rPr>
         <w:lastRenderedPageBreak/>
-        <w:t>S</w:t>
-      </w:r>
-      <w:r>
-        <w:rPr>
-          <w:b/>
-          <w:bCs/>
-          <w:color w:val="000000" w:themeColor="text1"/>
-        </w:rPr>
-        <w:t xml:space="preserve">elected </w:t>
-      </w:r>
-      <w:r>
-        <w:rPr>
-          <w:b/>
-          <w:bCs/>
-          <w:color w:val="000000" w:themeColor="text1"/>
-        </w:rPr>
-        <w:t>S</w:t>
-      </w:r>
-      <w:r>
-        <w:rPr>
-          <w:b/>
-          <w:bCs/>
-          <w:color w:val="000000" w:themeColor="text1"/>
-        </w:rPr>
-        <w:t xml:space="preserve">cenario </w:t>
-      </w:r>
-      <w:r>
-        <w:rPr>
-          <w:b/>
-          <w:bCs/>
-          <w:color w:val="000000" w:themeColor="text1"/>
-        </w:rPr>
-        <w:t>D</w:t>
-      </w:r>
-      <w:r>
-        <w:rPr>
-          <w:b/>
-          <w:bCs/>
-          <w:color w:val="000000" w:themeColor="text1"/>
-        </w:rPr>
-        <w:t>escription</w:t>
+        <w:t>Selected Scenario Description</w:t>
       </w:r>
     </w:p>
     <w:p/>
@@ -820,15 +780,7 @@
           <w:color w:val="000000" w:themeColor="text1"/>
         </w:rPr>
         <w:lastRenderedPageBreak/>
-        <w:t>I</w:t>
-      </w:r>
-      <w:r>
-        <w:rPr>
-          <w:b/>
-          <w:bCs/>
-          <w:color w:val="000000" w:themeColor="text1"/>
-        </w:rPr>
-        <w:t xml:space="preserve">nitial TIVIDY </w:t>
+        <w:t xml:space="preserve">Initial TIVIDY </w:t>
       </w:r>
       <w:r>
         <w:rPr>
@@ -1098,15 +1050,7 @@
           <w:bCs/>
           <w:color w:val="000000" w:themeColor="text1"/>
         </w:rPr>
-        <w:t xml:space="preserve"> Diagram</w:t>
-      </w:r>
-      <w:r>
-        <w:rPr>
-          <w:b/>
-          <w:bCs/>
-          <w:color w:val="000000" w:themeColor="text1"/>
-        </w:rPr>
-        <w:t xml:space="preserve"> </w:t>
+        <w:t xml:space="preserve"> Diagram </w:t>
       </w:r>
       <w:r>
         <w:rPr>
@@ -1229,15 +1173,7 @@
           <w:bCs/>
           <w:color w:val="000000" w:themeColor="text1"/>
         </w:rPr>
-        <w:t xml:space="preserve"> Diagram</w:t>
-      </w:r>
-      <w:r>
-        <w:rPr>
-          <w:b/>
-          <w:bCs/>
-          <w:color w:val="000000" w:themeColor="text1"/>
-        </w:rPr>
-        <w:t xml:space="preserve"> </w:t>
+        <w:t xml:space="preserve"> Diagram </w:t>
       </w:r>
       <w:r>
         <w:rPr>
@@ -1276,7 +1212,7 @@
         </w:rPr>
         <w:lastRenderedPageBreak/>
         <w:drawing>
-          <wp:anchor distT="0" distB="0" distL="114300" distR="114300" simplePos="0" relativeHeight="251663360" behindDoc="0" locked="0" layoutInCell="1" allowOverlap="1" wp14:anchorId="3C587DDC" wp14:editId="5D65567B">
+          <wp:anchor distT="0" distB="0" distL="114300" distR="114300" simplePos="0" relativeHeight="251663360" behindDoc="0" locked="0" layoutInCell="1" allowOverlap="1" wp14:anchorId="3C587DDC" wp14:editId="3BE5A5D4">
             <wp:simplePos x="0" y="0"/>
             <wp:positionH relativeFrom="column">
               <wp:align>center</wp:align>
@@ -1360,15 +1296,7 @@
           <w:bCs/>
           <w:color w:val="000000" w:themeColor="text1"/>
         </w:rPr>
-        <w:t xml:space="preserve"> Diagram</w:t>
-      </w:r>
-      <w:r>
-        <w:rPr>
-          <w:b/>
-          <w:bCs/>
-          <w:color w:val="000000" w:themeColor="text1"/>
-        </w:rPr>
-        <w:t xml:space="preserve"> 3</w:t>
+        <w:t xml:space="preserve"> Diagram 3</w:t>
       </w:r>
       <w:r>
         <w:rPr>
@@ -1400,15 +1328,7 @@
           <w:color w:val="000000" w:themeColor="text1"/>
         </w:rPr>
         <w:lastRenderedPageBreak/>
-        <w:t>C</w:t>
-      </w:r>
-      <w:r>
-        <w:rPr>
-          <w:b/>
-          <w:bCs/>
-          <w:color w:val="000000" w:themeColor="text1"/>
-        </w:rPr>
-        <w:t>omplete UML Class Diagra</w:t>
+        <w:t>Complete UML Class Diagra</w:t>
       </w:r>
       <w:r>
         <w:rPr>
@@ -4504,11 +4424,78 @@
       </w:pPr>
       <w:r>
         <w:rPr>
+          <w:noProof/>
+        </w:rPr>
+        <w:lastRenderedPageBreak/>
+        <w:drawing>
+          <wp:anchor distT="0" distB="0" distL="114300" distR="114300" simplePos="0" relativeHeight="251667456" behindDoc="0" locked="0" layoutInCell="1" allowOverlap="1" wp14:anchorId="679593D9" wp14:editId="095A0800">
+            <wp:simplePos x="0" y="0"/>
+            <wp:positionH relativeFrom="margin">
+              <wp:align>center</wp:align>
+            </wp:positionH>
+            <wp:positionV relativeFrom="paragraph">
+              <wp:posOffset>388620</wp:posOffset>
+            </wp:positionV>
+            <wp:extent cx="10044000" cy="5403600"/>
+            <wp:effectExtent l="0" t="0" r="0" b="6985"/>
+            <wp:wrapSquare wrapText="bothSides"/>
+            <wp:docPr id="1098697047" name="Picture 1"/>
+            <wp:cNvGraphicFramePr>
+              <a:graphicFrameLocks xmlns:a="http://schemas.openxmlformats.org/drawingml/2006/main" noChangeAspect="1"/>
+            </wp:cNvGraphicFramePr>
+            <a:graphic xmlns:a="http://schemas.openxmlformats.org/drawingml/2006/main">
+              <a:graphicData uri="http://schemas.openxmlformats.org/drawingml/2006/picture">
+                <pic:pic xmlns:pic="http://schemas.openxmlformats.org/drawingml/2006/picture">
+                  <pic:nvPicPr>
+                    <pic:cNvPr id="0" name="Picture 2"/>
+                    <pic:cNvPicPr>
+                      <a:picLocks noChangeAspect="1" noChangeArrowheads="1"/>
+                    </pic:cNvPicPr>
+                  </pic:nvPicPr>
+                  <pic:blipFill>
+                    <a:blip r:embed="rId13">
+                      <a:extLst>
+                        <a:ext uri="{28A0092B-C50C-407E-A947-70E740481C1C}">
+                          <a14:useLocalDpi xmlns:a14="http://schemas.microsoft.com/office/drawing/2010/main" val="0"/>
+                        </a:ext>
+                      </a:extLst>
+                    </a:blip>
+                    <a:srcRect/>
+                    <a:stretch>
+                      <a:fillRect/>
+                    </a:stretch>
+                  </pic:blipFill>
+                  <pic:spPr bwMode="auto">
+                    <a:xfrm>
+                      <a:off x="0" y="0"/>
+                      <a:ext cx="10044000" cy="5403600"/>
+                    </a:xfrm>
+                    <a:prstGeom prst="rect">
+                      <a:avLst/>
+                    </a:prstGeom>
+                    <a:noFill/>
+                    <a:ln>
+                      <a:noFill/>
+                    </a:ln>
+                  </pic:spPr>
+                </pic:pic>
+              </a:graphicData>
+            </a:graphic>
+            <wp14:sizeRelH relativeFrom="page">
+              <wp14:pctWidth>0</wp14:pctWidth>
+            </wp14:sizeRelH>
+            <wp14:sizeRelV relativeFrom="page">
+              <wp14:pctHeight>0</wp14:pctHeight>
+            </wp14:sizeRelV>
+          </wp:anchor>
+        </w:drawing>
+      </w:r>
+      <w:r>
+        <w:rPr>
           <w:b/>
           <w:bCs/>
           <w:color w:val="000000" w:themeColor="text1"/>
         </w:rPr>
-        <w:lastRenderedPageBreak/>
         <w:t>UML Sequence Diagram</w:t>
       </w:r>
       <w:r>
@@ -4538,33 +4525,92 @@
       </w:pPr>
       <w:r>
         <w:rPr>
+          <w:noProof/>
+        </w:rPr>
+        <w:lastRenderedPageBreak/>
+        <w:drawing>
+          <wp:anchor distT="0" distB="0" distL="114300" distR="114300" simplePos="0" relativeHeight="251669504" behindDoc="0" locked="0" layoutInCell="1" allowOverlap="1" wp14:anchorId="08F450EE" wp14:editId="0AD8DB18">
+            <wp:simplePos x="0" y="0"/>
+            <wp:positionH relativeFrom="margin">
+              <wp:align>center</wp:align>
+            </wp:positionH>
+            <wp:positionV relativeFrom="paragraph">
+              <wp:posOffset>334645</wp:posOffset>
+            </wp:positionV>
+            <wp:extent cx="6796800" cy="5936400"/>
+            <wp:effectExtent l="0" t="0" r="4445" b="7620"/>
+            <wp:wrapSquare wrapText="bothSides"/>
+            <wp:docPr id="1508136344" name="Picture 2"/>
+            <wp:cNvGraphicFramePr>
+              <a:graphicFrameLocks xmlns:a="http://schemas.openxmlformats.org/drawingml/2006/main" noChangeAspect="1"/>
+            </wp:cNvGraphicFramePr>
+            <a:graphic xmlns:a="http://schemas.openxmlformats.org/drawingml/2006/main">
+              <a:graphicData uri="http://schemas.openxmlformats.org/drawingml/2006/picture">
+                <pic:pic xmlns:pic="http://schemas.openxmlformats.org/drawingml/2006/picture">
+                  <pic:nvPicPr>
+                    <pic:cNvPr id="0" name="Picture 3"/>
+                    <pic:cNvPicPr>
+                      <a:picLocks noChangeAspect="1" noChangeArrowheads="1"/>
+                    </pic:cNvPicPr>
+                  </pic:nvPicPr>
+                  <pic:blipFill>
+                    <a:blip r:embed="rId14">
+                      <a:extLst>
+                        <a:ext uri="{28A0092B-C50C-407E-A947-70E740481C1C}">
+                          <a14:useLocalDpi xmlns:a14="http://schemas.microsoft.com/office/drawing/2010/main" val="0"/>
+                        </a:ext>
+                      </a:extLst>
+                    </a:blip>
+                    <a:srcRect/>
+                    <a:stretch>
+                      <a:fillRect/>
+                    </a:stretch>
+                  </pic:blipFill>
+                  <pic:spPr bwMode="auto">
+                    <a:xfrm>
+                      <a:off x="0" y="0"/>
+                      <a:ext cx="6796800" cy="5936400"/>
+                    </a:xfrm>
+                    <a:prstGeom prst="rect">
+                      <a:avLst/>
+                    </a:prstGeom>
+                    <a:noFill/>
+                    <a:ln>
+                      <a:noFill/>
+                    </a:ln>
+                  </pic:spPr>
+                </pic:pic>
+              </a:graphicData>
+            </a:graphic>
+            <wp14:sizeRelH relativeFrom="page">
+              <wp14:pctWidth>0</wp14:pctWidth>
+            </wp14:sizeRelH>
+            <wp14:sizeRelV relativeFrom="page">
+              <wp14:pctHeight>0</wp14:pctHeight>
+            </wp14:sizeRelV>
+          </wp:anchor>
+        </w:drawing>
+      </w:r>
+      <w:r>
+        <w:rPr>
           <w:b/>
           <w:bCs/>
           <w:color w:val="000000" w:themeColor="text1"/>
         </w:rPr>
-        <w:lastRenderedPageBreak/>
-        <w:t>UML Sequence Diagram</w:t>
-      </w:r>
-      <w:r>
+        <w:t>UML Sequence Diagram 2</w:t>
+      </w:r>
+    </w:p>
+    <w:p>
+      <w:pPr>
+        <w:pStyle w:val="Heading2"/>
+        <w:jc w:val="center"/>
         <w:rPr>
           <w:b/>
           <w:bCs/>
           <w:color w:val="000000" w:themeColor="text1"/>
         </w:rPr>
-        <w:t xml:space="preserve"> 2</w:t>
-      </w:r>
-    </w:p>
-    <w:p>
-      <w:pPr>
-        <w:pStyle w:val="Heading2"/>
-        <w:jc w:val="center"/>
-        <w:rPr>
-          <w:b/>
-          <w:bCs/>
-          <w:color w:val="000000" w:themeColor="text1"/>
-        </w:rPr>
         <w:sectPr>
-          <w:pgSz w:w="16838" w:h="11906" w:orient="landscape"/>
+          <w:pgSz w:w="11906" w:h="16838"/>
           <w:pgMar w:top="720" w:right="720" w:bottom="720" w:left="720" w:header="709" w:footer="709" w:gutter="0"/>
           <w:cols w:space="708"/>
           <w:docGrid w:linePitch="360"/>
@@ -4572,11 +4618,78 @@
       </w:pPr>
       <w:r>
         <w:rPr>
+          <w:noProof/>
+        </w:rPr>
+        <w:lastRenderedPageBreak/>
+        <w:drawing>
+          <wp:anchor distT="0" distB="0" distL="114300" distR="114300" simplePos="0" relativeHeight="251671552" behindDoc="0" locked="0" layoutInCell="1" allowOverlap="1" wp14:anchorId="3C534B3B" wp14:editId="760BC085">
+            <wp:simplePos x="0" y="0"/>
+            <wp:positionH relativeFrom="column">
+              <wp:align>center</wp:align>
+            </wp:positionH>
+            <wp:positionV relativeFrom="paragraph">
+              <wp:posOffset>370840</wp:posOffset>
+            </wp:positionV>
+            <wp:extent cx="4435200" cy="9039600"/>
+            <wp:effectExtent l="0" t="0" r="3810" b="0"/>
+            <wp:wrapSquare wrapText="bothSides"/>
+            <wp:docPr id="1091773817" name="Picture 3"/>
+            <wp:cNvGraphicFramePr>
+              <a:graphicFrameLocks xmlns:a="http://schemas.openxmlformats.org/drawingml/2006/main" noChangeAspect="1"/>
+            </wp:cNvGraphicFramePr>
+            <a:graphic xmlns:a="http://schemas.openxmlformats.org/drawingml/2006/main">
+              <a:graphicData uri="http://schemas.openxmlformats.org/drawingml/2006/picture">
+                <pic:pic xmlns:pic="http://schemas.openxmlformats.org/drawingml/2006/picture">
+                  <pic:nvPicPr>
+                    <pic:cNvPr id="0" name="Picture 4"/>
+                    <pic:cNvPicPr>
+                      <a:picLocks noChangeAspect="1" noChangeArrowheads="1"/>
+                    </pic:cNvPicPr>
+                  </pic:nvPicPr>
+                  <pic:blipFill>
+                    <a:blip r:embed="rId15">
+                      <a:extLst>
+                        <a:ext uri="{28A0092B-C50C-407E-A947-70E740481C1C}">
+                          <a14:useLocalDpi xmlns:a14="http://schemas.microsoft.com/office/drawing/2010/main" val="0"/>
+                        </a:ext>
+                      </a:extLst>
+                    </a:blip>
+                    <a:srcRect/>
+                    <a:stretch>
+                      <a:fillRect/>
+                    </a:stretch>
+                  </pic:blipFill>
+                  <pic:spPr bwMode="auto">
+                    <a:xfrm>
+                      <a:off x="0" y="0"/>
+                      <a:ext cx="4435200" cy="9039600"/>
+                    </a:xfrm>
+                    <a:prstGeom prst="rect">
+                      <a:avLst/>
+                    </a:prstGeom>
+                    <a:noFill/>
+                    <a:ln>
+                      <a:noFill/>
+                    </a:ln>
+                  </pic:spPr>
+                </pic:pic>
+              </a:graphicData>
+            </a:graphic>
+            <wp14:sizeRelH relativeFrom="page">
+              <wp14:pctWidth>0</wp14:pctWidth>
+            </wp14:sizeRelH>
+            <wp14:sizeRelV relativeFrom="page">
+              <wp14:pctHeight>0</wp14:pctHeight>
+            </wp14:sizeRelV>
+          </wp:anchor>
+        </w:drawing>
+      </w:r>
+      <w:r>
+        <w:rPr>
           <w:b/>
           <w:bCs/>
           <w:color w:val="000000" w:themeColor="text1"/>
         </w:rPr>
-        <w:lastRenderedPageBreak/>
         <w:t>UML State Diagram</w:t>
       </w:r>
     </w:p>
@@ -4597,63 +4710,7 @@
           <w:color w:val="000000" w:themeColor="text1"/>
         </w:rPr>
         <w:lastRenderedPageBreak/>
-        <w:t>I</w:t>
-      </w:r>
-      <w:r>
-        <w:rPr>
-          <w:b/>
-          <w:bCs/>
-          <w:color w:val="000000" w:themeColor="text1"/>
-        </w:rPr>
-        <w:t xml:space="preserve">mportant </w:t>
-      </w:r>
-      <w:r>
-        <w:rPr>
-          <w:b/>
-          <w:bCs/>
-          <w:color w:val="000000" w:themeColor="text1"/>
-        </w:rPr>
-        <w:t>D</w:t>
-      </w:r>
-      <w:r>
-        <w:rPr>
-          <w:b/>
-          <w:bCs/>
-          <w:color w:val="000000" w:themeColor="text1"/>
-        </w:rPr>
-        <w:t xml:space="preserve">esign </w:t>
-      </w:r>
-      <w:r>
-        <w:rPr>
-          <w:b/>
-          <w:bCs/>
-          <w:color w:val="000000" w:themeColor="text1"/>
-        </w:rPr>
-        <w:t>D</w:t>
-      </w:r>
-      <w:r>
-        <w:rPr>
-          <w:b/>
-          <w:bCs/>
-          <w:color w:val="000000" w:themeColor="text1"/>
-        </w:rPr>
-        <w:t xml:space="preserve">ecisions and </w:t>
-      </w:r>
-      <w:r>
-        <w:rPr>
-          <w:b/>
-          <w:bCs/>
-          <w:color w:val="000000" w:themeColor="text1"/>
-        </w:rPr>
-        <w:t>R</w:t>
-      </w:r>
-      <w:r>
-        <w:rPr>
-          <w:b/>
-          <w:bCs/>
-          <w:color w:val="000000" w:themeColor="text1"/>
-        </w:rPr>
-        <w:t>evision history</w:t>
+        <w:t>Important Design Decisions and Revision history</w:t>
       </w:r>
     </w:p>
     <w:p>
@@ -4663,8 +4720,8 @@
           <w:color w:val="auto"/>
         </w:rPr>
       </w:pPr>
-      <w:bookmarkStart w:id="0" w:name="design-decisions-and-revision-history"/>
-      <w:bookmarkStart w:id="1" w:name="removed-the-workflow-template"/>
+      <w:bookmarkStart w:id="0" w:name="removed-the-workflow-template"/>
+      <w:bookmarkStart w:id="1" w:name="design-decisions-and-revision-history"/>
     </w:p>
     <w:p>
       <w:pPr>
@@ -4718,7 +4775,7 @@
         </w:rPr>
       </w:pPr>
       <w:bookmarkStart w:id="2" w:name="worknode-now-has-7-states"/>
-      <w:bookmarkEnd w:id="1"/>
+      <w:bookmarkEnd w:id="0"/>
       <w:r>
         <w:rPr>
           <w:color w:val="auto"/>
@@ -5203,7 +5260,7 @@
         <w:t>Diagrams: Class diagram, Activity Diagram 2.</w:t>
       </w:r>
     </w:p>
-    <w:bookmarkEnd w:id="0"/>
+    <w:bookmarkEnd w:id="1"/>
     <w:bookmarkEnd w:id="10"/>
     <w:p/>
     <w:p/>
@@ -5291,6 +5348,8 @@
     <w:p>
       <w:pPr>
         <w:pStyle w:val="ListParagraph"/>
+        <w:ind w:left="0"/>
+        <w:jc w:val="both"/>
         <w:rPr>
           <w:color w:val="000000" w:themeColor="text1"/>
         </w:rPr>
@@ -6738,6 +6797,7 @@
   <w:style w:type="character" w:default="1" w:styleId="DefaultParagraphFont">
     <w:name w:val="Default Paragraph Font"/>
     <w:uiPriority w:val="1"/>
+    <w:semiHidden/>
     <w:unhideWhenUsed/>
   </w:style>
   <w:style w:type="table" w:default="1" w:styleId="TableNormal">

</xml_diff>